<commit_message>
C: update nooijd ung file
</commit_message>
<xml_diff>
--- a/A1.docx
+++ b/A1.docx
@@ -11,8 +11,13 @@
       </w:r>
     </w:p>
     <w:p>
+      <w:r>
+        <w:t xml:space="preserve"> Edit client</w:t>
+      </w:r>
+    </w:p>
+    <w:p>
       <w:pPr>
-        <w:pStyle w:val="Heading1"/>
+        <w:pStyle w:val="Heading2"/>
       </w:pPr>
       <w:r>
         <w:t>A2</w:t>
@@ -464,7 +469,6 @@
     <w:next w:val="Normal"/>
     <w:link w:val="Heading2Char"/>
     <w:uiPriority w:val="9"/>
-    <w:semiHidden/>
     <w:unhideWhenUsed/>
     <w:qFormat/>
     <w:rsid w:val="00654813"/>
@@ -681,7 +685,6 @@
     <w:basedOn w:val="DefaultParagraphFont"/>
     <w:link w:val="Heading2"/>
     <w:uiPriority w:val="9"/>
-    <w:semiHidden/>
     <w:rsid w:val="00654813"/>
     <w:rPr>
       <w:rFonts w:asciiTheme="majorHAnsi" w:eastAsiaTheme="majorEastAsia" w:hAnsiTheme="majorHAnsi" w:cstheme="majorBidi"/>

</xml_diff>

<commit_message>
Client: File A: Update  content file A1
</commit_message>
<xml_diff>
--- a/A1.docx
+++ b/A1.docx
@@ -8,6 +8,20 @@
       </w:pPr>
       <w:r>
         <w:t>A1</w:t>
+      </w:r>
+    </w:p>
+    <w:p/>
+    <w:p>
+      <w:r>
+        <w:t xml:space="preserve"> Update </w:t>
+      </w:r>
+      <w:proofErr w:type="spellStart"/>
+      <w:r>
+        <w:t>noi</w:t>
+      </w:r>
+      <w:proofErr w:type="spellEnd"/>
+      <w:r>
+        <w:t xml:space="preserve"> dung client</w:t>
       </w:r>
     </w:p>
     <w:p>

</xml_diff>